<commit_message>
feat(saff-study): publish specification and test suite v1.6
</commit_message>
<xml_diff>
--- a/output/docx/ExtracaoOffline.docx
+++ b/output/docx/ExtracaoOffline.docx
@@ -873,7 +873,7 @@
               <w:rPr>
                 <w:sz w:val="18"/>
               </w:rPr>
-              <w:t>SYSTEM exibe tela para entrada em modo offline</w:t>
+              <w:t>SYSTEM processes action successfully</w:t>
             </w:r>
           </w:p>
         </w:tc>
@@ -1116,7 +1116,7 @@
           <w:sz w:val="24"/>
           <w:color w:val="2B6CB0"/>
         </w:rPr>
-        <w:t>[TC7] Alternative Flow 6: Product number e serial number que nao casam</w:t>
+        <w:t xml:space="preserve">[TC7] Exception Flow 1: Sem conexao e usuario deseja entrar em modo offline </w:t>
       </w:r>
     </w:p>
     <w:p>
@@ -1152,7 +1152,7 @@
         <w:rPr>
           <w:sz w:val="20"/>
         </w:rPr>
-        <w:t>extracoes foram realizadas (tempo de cada extracao deve ser o momento que esta foi feita em modo offline)</w:t>
+        <w:t>Flow interrupted due to exception / error</w:t>
       </w:r>
     </w:p>
     <w:tbl>
@@ -1307,17 +1307,17 @@
               <w:rPr>
                 <w:sz w:val="18"/>
               </w:rPr>
-              <w:t>operador: digita um product number e serial number validos mas nao referentes a mesma familia e pressiona Extract (terminal em modo LLT)</w:t>
-            </w:r>
-          </w:p>
-        </w:tc>
-        <w:tc>
-          <w:p>
-            <w:r>
-              <w:rPr>
-                <w:sz w:val="18"/>
-              </w:rPr>
-              <w:t>SYSTEM apresenta mensagem de erro</w:t>
+              <w:t>operador: digita um product number e serial number validos e pressiona Extract (terminal em modo LLT)</w:t>
+            </w:r>
+          </w:p>
+        </w:tc>
+        <w:tc>
+          <w:p>
+            <w:r>
+              <w:rPr>
+                <w:sz w:val="18"/>
+              </w:rPr>
+              <w:t>SYSTEM exibe mensagem solicitando confirmacao se usuario quer entrar em modo offline</w:t>
             </w:r>
           </w:p>
         </w:tc>
@@ -1339,17 +1339,17 @@
               <w:rPr>
                 <w:sz w:val="18"/>
               </w:rPr>
-              <w:t>operador: escolhe opcao Pre_Test para tipo de teste</w:t>
-            </w:r>
-          </w:p>
-        </w:tc>
-        <w:tc>
-          <w:p>
-            <w:r>
-              <w:rPr>
-                <w:sz w:val="18"/>
-              </w:rPr>
-              <w:t>SYSTEM apresenta a marcacao da opcao escolhida</w:t>
+              <w:t>operador: confirma que quer entrar em modo offline</w:t>
+            </w:r>
+          </w:p>
+        </w:tc>
+        <w:tc>
+          <w:p>
+            <w:r>
+              <w:rPr>
+                <w:sz w:val="18"/>
+              </w:rPr>
+              <w:t>SYSTEM exibe pagina que requisita dados do terminal</w:t>
             </w:r>
           </w:p>
         </w:tc>
@@ -1371,17 +1371,81 @@
               <w:rPr>
                 <w:sz w:val="18"/>
               </w:rPr>
-              <w:t>operador: digita um product number e serial number validos e pressiona Extract (terminal em modo LLT)</w:t>
-            </w:r>
-          </w:p>
-        </w:tc>
-        <w:tc>
-          <w:p>
-            <w:r>
-              <w:rPr>
-                <w:sz w:val="18"/>
-              </w:rPr>
-              <w:t>SYSTEM exibe tela para entrada em modo offline</w:t>
+              <w:t>operador: realiza uma serie de extracoes sequenciais</w:t>
+            </w:r>
+          </w:p>
+        </w:tc>
+        <w:tc>
+          <w:p>
+            <w:r>
+              <w:rPr>
+                <w:sz w:val="18"/>
+              </w:rPr>
+              <w:t>SYSTEM salva as extracoes na pasta local 'OfflineExtraction'</w:t>
+            </w:r>
+          </w:p>
+        </w:tc>
+      </w:tr>
+      <w:tr>
+        <w:tc>
+          <w:p>
+            <w:r>
+              <w:rPr>
+                <w:sz w:val="18"/>
+              </w:rPr>
+              <w:t>6</w:t>
+            </w:r>
+          </w:p>
+        </w:tc>
+        <w:tc>
+          <w:p>
+            <w:r>
+              <w:rPr>
+                <w:sz w:val="18"/>
+              </w:rPr>
+              <w:t>operador: reastabelece conexao</w:t>
+            </w:r>
+          </w:p>
+        </w:tc>
+        <w:tc>
+          <w:p>
+            <w:r>
+              <w:rPr>
+                <w:sz w:val="18"/>
+              </w:rPr>
+              <w:t>SYSTEM envia extracoes locais para o servidor e as apaga da pasta local 'OfflineExtraction'</w:t>
+            </w:r>
+          </w:p>
+        </w:tc>
+      </w:tr>
+      <w:tr>
+        <w:tc>
+          <w:p>
+            <w:r>
+              <w:rPr>
+                <w:sz w:val="18"/>
+              </w:rPr>
+              <w:t>7</w:t>
+            </w:r>
+          </w:p>
+        </w:tc>
+        <w:tc>
+          <w:p>
+            <w:r>
+              <w:rPr>
+                <w:sz w:val="18"/>
+              </w:rPr>
+              <w:t>operador: loga no servidor e vai ate a pagina de extracoes</w:t>
+            </w:r>
+          </w:p>
+        </w:tc>
+        <w:tc>
+          <w:p>
+            <w:r>
+              <w:rPr>
+                <w:sz w:val="18"/>
+              </w:rPr>
+              <w:t>SYSTEM exibe lista com extracoes realizadas no modo offline</w:t>
             </w:r>
           </w:p>
         </w:tc>
@@ -1402,7 +1466,7 @@
           <w:sz w:val="24"/>
           <w:color w:val="2B6CB0"/>
         </w:rPr>
-        <w:t xml:space="preserve">[TC8] Exception Flow 1: Sem conexao e usuario deseja entrar em modo offline </w:t>
+        <w:t xml:space="preserve">[TC8] Exception Flow 2: Sem conexao e usuario nao deseja entrar em modo offline </w:t>
       </w:r>
     </w:p>
     <w:p>
@@ -1603,7 +1667,7 @@
               <w:rPr>
                 <w:sz w:val="18"/>
               </w:rPr>
-              <w:t>SYSTEM exibe mensagem solicitando confirmacao se usuario quer entrar em modo offline</w:t>
+              <w:t>SYSTEM exibe mensagem solicitando confirmação se usuario quer entrar em modo offline</w:t>
             </w:r>
           </w:p>
         </w:tc>
@@ -1625,113 +1689,17 @@
               <w:rPr>
                 <w:sz w:val="18"/>
               </w:rPr>
-              <w:t>operador: confirma que quer entrar em modo offline</w:t>
-            </w:r>
-          </w:p>
-        </w:tc>
-        <w:tc>
-          <w:p>
-            <w:r>
-              <w:rPr>
-                <w:sz w:val="18"/>
-              </w:rPr>
-              <w:t>SYSTEM exibe pagina que requisita dados do terminal</w:t>
-            </w:r>
-          </w:p>
-        </w:tc>
-      </w:tr>
-      <w:tr>
-        <w:tc>
-          <w:p>
-            <w:r>
-              <w:rPr>
-                <w:sz w:val="18"/>
-              </w:rPr>
-              <w:t>5</w:t>
-            </w:r>
-          </w:p>
-        </w:tc>
-        <w:tc>
-          <w:p>
-            <w:r>
-              <w:rPr>
-                <w:sz w:val="18"/>
-              </w:rPr>
-              <w:t>operador: realiza uma serie de extracoes sequenciais</w:t>
-            </w:r>
-          </w:p>
-        </w:tc>
-        <w:tc>
-          <w:p>
-            <w:r>
-              <w:rPr>
-                <w:sz w:val="18"/>
-              </w:rPr>
-              <w:t>SYSTEM salva as extracoes na pasta local 'OfflineExtraction'</w:t>
-            </w:r>
-          </w:p>
-        </w:tc>
-      </w:tr>
-      <w:tr>
-        <w:tc>
-          <w:p>
-            <w:r>
-              <w:rPr>
-                <w:sz w:val="18"/>
-              </w:rPr>
-              <w:t>6</w:t>
-            </w:r>
-          </w:p>
-        </w:tc>
-        <w:tc>
-          <w:p>
-            <w:r>
-              <w:rPr>
-                <w:sz w:val="18"/>
-              </w:rPr>
-              <w:t>operador: reastabelece conexao</w:t>
-            </w:r>
-          </w:p>
-        </w:tc>
-        <w:tc>
-          <w:p>
-            <w:r>
-              <w:rPr>
-                <w:sz w:val="18"/>
-              </w:rPr>
-              <w:t>SYSTEM envia extracoes locais para o servidor e as apaga da pasta local 'OfflineExtraction'</w:t>
-            </w:r>
-          </w:p>
-        </w:tc>
-      </w:tr>
-      <w:tr>
-        <w:tc>
-          <w:p>
-            <w:r>
-              <w:rPr>
-                <w:sz w:val="18"/>
-              </w:rPr>
-              <w:t>7</w:t>
-            </w:r>
-          </w:p>
-        </w:tc>
-        <w:tc>
-          <w:p>
-            <w:r>
-              <w:rPr>
-                <w:sz w:val="18"/>
-              </w:rPr>
-              <w:t>operador: loga no servidor e vai ate a pagina de extracoes</w:t>
-            </w:r>
-          </w:p>
-        </w:tc>
-        <w:tc>
-          <w:p>
-            <w:r>
-              <w:rPr>
-                <w:sz w:val="18"/>
-              </w:rPr>
-              <w:t>SYSTEM exibe lista com extracoes realizadas no modo offline</w:t>
+              <w:t>operador: nao deseja entrar em modo offline</w:t>
+            </w:r>
+          </w:p>
+        </w:tc>
+        <w:tc>
+          <w:p>
+            <w:r>
+              <w:rPr>
+                <w:sz w:val="18"/>
+              </w:rPr>
+              <w:t>SYSTEM processes action successfully</w:t>
             </w:r>
           </w:p>
         </w:tc>
@@ -1752,7 +1720,7 @@
           <w:sz w:val="24"/>
           <w:color w:val="2B6CB0"/>
         </w:rPr>
-        <w:t xml:space="preserve">[TC9] Exception Flow 2: Sem conexao e usuario nao deseja entrar em modo offline </w:t>
+        <w:t>[TC9] Exception Flow 3: Cai conexao novamente</w:t>
       </w:r>
     </w:p>
     <w:p>
@@ -1879,260 +1847,6 @@
               <w:rPr>
                 <w:sz w:val="18"/>
               </w:rPr>
-              <w:t>operador: inicia o SAFF Extractor e se autentica</w:t>
-            </w:r>
-          </w:p>
-        </w:tc>
-        <w:tc>
-          <w:p>
-            <w:r>
-              <w:rPr>
-                <w:sz w:val="18"/>
-              </w:rPr>
-              <w:t>SYSTEM exibe pagina que requisita dados do terminal</w:t>
-            </w:r>
-          </w:p>
-        </w:tc>
-      </w:tr>
-      <w:tr>
-        <w:tc>
-          <w:p>
-            <w:r>
-              <w:rPr>
-                <w:sz w:val="18"/>
-              </w:rPr>
-              <w:t>2</w:t>
-            </w:r>
-          </w:p>
-        </w:tc>
-        <w:tc>
-          <w:p>
-            <w:r>
-              <w:rPr>
-                <w:sz w:val="18"/>
-              </w:rPr>
-              <w:t>operador: escolhe opcao Pre_Test para tipo de teste</w:t>
-            </w:r>
-          </w:p>
-        </w:tc>
-        <w:tc>
-          <w:p>
-            <w:r>
-              <w:rPr>
-                <w:sz w:val="18"/>
-              </w:rPr>
-              <w:t>SYSTEM apresenta a marcacao da opcao escolhida</w:t>
-            </w:r>
-          </w:p>
-        </w:tc>
-      </w:tr>
-      <w:tr>
-        <w:tc>
-          <w:p>
-            <w:r>
-              <w:rPr>
-                <w:sz w:val="18"/>
-              </w:rPr>
-              <w:t>3</w:t>
-            </w:r>
-          </w:p>
-        </w:tc>
-        <w:tc>
-          <w:p>
-            <w:r>
-              <w:rPr>
-                <w:sz w:val="18"/>
-              </w:rPr>
-              <w:t>operador: digita um product number e serial number validos e pressiona Extract (terminal em modo LLT)</w:t>
-            </w:r>
-          </w:p>
-        </w:tc>
-        <w:tc>
-          <w:p>
-            <w:r>
-              <w:rPr>
-                <w:sz w:val="18"/>
-              </w:rPr>
-              <w:t>SYSTEM exibe mensagem solicitando confirmação se usuario quer entrar em modo offline</w:t>
-            </w:r>
-          </w:p>
-        </w:tc>
-      </w:tr>
-      <w:tr>
-        <w:tc>
-          <w:p>
-            <w:r>
-              <w:rPr>
-                <w:sz w:val="18"/>
-              </w:rPr>
-              <w:t>4</w:t>
-            </w:r>
-          </w:p>
-        </w:tc>
-        <w:tc>
-          <w:p>
-            <w:r>
-              <w:rPr>
-                <w:sz w:val="18"/>
-              </w:rPr>
-              <w:t>operador: nao deseja entrar em modo offline</w:t>
-            </w:r>
-          </w:p>
-        </w:tc>
-        <w:tc>
-          <w:p>
-            <w:r>
-              <w:rPr>
-                <w:sz w:val="18"/>
-              </w:rPr>
-              <w:t>SYSTEM processes action successfully</w:t>
-            </w:r>
-          </w:p>
-        </w:tc>
-      </w:tr>
-    </w:tbl>
-    <w:p>
-      <w:r>
-        <w:br/>
-      </w:r>
-    </w:p>
-    <w:p>
-      <w:pPr>
-        <w:spacing w:before="180" w:after="60"/>
-      </w:pPr>
-      <w:r>
-        <w:rPr>
-          <w:b w:val="on"/>
-          <w:sz w:val="24"/>
-          <w:color w:val="2B6CB0"/>
-        </w:rPr>
-        <w:t>[TC10] Exception Flow 3: Cai conexao novamente</w:t>
-      </w:r>
-    </w:p>
-    <w:p>
-      <w:pPr>
-        <w:spacing w:after="40"/>
-      </w:pPr>
-      <w:r>
-        <w:rPr>
-          <w:b w:val="on"/>
-          <w:sz w:val="20"/>
-        </w:rPr>
-        <w:t xml:space="preserve">Preconditions: </w:t>
-      </w:r>
-      <w:r>
-        <w:rPr>
-          <w:sz w:val="20"/>
-        </w:rPr>
-        <w:t xml:space="preserve"> </w:t>
-      </w:r>
-    </w:p>
-    <w:p>
-      <w:pPr>
-        <w:spacing w:after="40"/>
-      </w:pPr>
-      <w:r>
-        <w:rPr>
-          <w:b w:val="on"/>
-          <w:sz w:val="20"/>
-        </w:rPr>
-        <w:t xml:space="preserve">Postconditions: </w:t>
-      </w:r>
-      <w:r>
-        <w:rPr>
-          <w:sz w:val="20"/>
-        </w:rPr>
-        <w:t>Flow interrupted due to exception / error</w:t>
-      </w:r>
-    </w:p>
-    <w:tbl>
-      <w:tblPr>
-        <w:tblW w:w="5000" w:type="pct"/>
-        <w:tblBorders>
-          <w:top w:val="single"/>
-          <w:left w:val="single"/>
-          <w:bottom w:val="single"/>
-          <w:right w:val="single"/>
-          <w:insideH w:val="single"/>
-          <w:insideV w:val="single"/>
-        </w:tblBorders>
-      </w:tblPr>
-      <w:tr>
-        <w:tc>
-          <w:tcPr>
-            <w:tcW w:w="1200" w:type="dxa"/>
-            <w:shd w:color="auto" w:val="clear" w:fill="2B6CB0"/>
-          </w:tcPr>
-          <w:p>
-            <w:pPr>
-              <w:jc w:val="left"/>
-            </w:pPr>
-            <w:r>
-              <w:rPr>
-                <w:b w:val="on"/>
-                <w:sz w:val="20"/>
-                <w:color w:val="FFFFFF"/>
-              </w:rPr>
-              <w:t>Step #</w:t>
-            </w:r>
-          </w:p>
-        </w:tc>
-        <w:tc>
-          <w:tcPr>
-            <w:tcW w:w="4500" w:type="dxa"/>
-            <w:shd w:color="auto" w:val="clear" w:fill="2B6CB0"/>
-          </w:tcPr>
-          <w:p>
-            <w:pPr>
-              <w:jc w:val="left"/>
-            </w:pPr>
-            <w:r>
-              <w:rPr>
-                <w:b w:val="on"/>
-                <w:sz w:val="20"/>
-                <w:color w:val="FFFFFF"/>
-              </w:rPr>
-              <w:t>Actor Action</w:t>
-            </w:r>
-          </w:p>
-        </w:tc>
-        <w:tc>
-          <w:tcPr>
-            <w:tcW w:w="4500" w:type="dxa"/>
-            <w:shd w:color="auto" w:val="clear" w:fill="2B6CB0"/>
-          </w:tcPr>
-          <w:p>
-            <w:pPr>
-              <w:jc w:val="left"/>
-            </w:pPr>
-            <w:r>
-              <w:rPr>
-                <w:b w:val="on"/>
-                <w:sz w:val="20"/>
-                <w:color w:val="FFFFFF"/>
-              </w:rPr>
-              <w:t>Expected Result (System)</w:t>
-            </w:r>
-          </w:p>
-        </w:tc>
-      </w:tr>
-      <w:tr>
-        <w:tc>
-          <w:p>
-            <w:r>
-              <w:rPr>
-                <w:sz w:val="18"/>
-              </w:rPr>
-              <w:t>1</w:t>
-            </w:r>
-          </w:p>
-        </w:tc>
-        <w:tc>
-          <w:p>
-            <w:r>
-              <w:rPr>
-                <w:sz w:val="18"/>
-              </w:rPr>
               <w:t>system: SYSTEM: mantem informacao das extracoes nao enviadas a tempo na pasta local</w:t>
             </w:r>
           </w:p>

</xml_diff>

<commit_message>
feat(saff-study): publish specification and test suite v2.0
</commit_message>
<xml_diff>
--- a/output/docx/ExtracaoOffline.docx
+++ b/output/docx/ExtracaoOffline.docx
@@ -88,7 +88,7 @@
         <w:rPr>
           <w:sz w:val="20"/>
         </w:rPr>
-        <w:t xml:space="preserve"> </w:t>
+        <w:t>Usuário está logado no servidor</w:t>
       </w:r>
     </w:p>
     <w:p>
@@ -106,7 +106,7 @@
         <w:rPr>
           <w:sz w:val="20"/>
         </w:rPr>
-        <w:t>extracoes foram realizadas (tempo de cada extracao deve ser o momento que esta foi feita em modo offline)</w:t>
+        <w:t/>
       </w:r>
     </w:p>
     <w:tbl>
@@ -197,17 +197,17 @@
               <w:rPr>
                 <w:sz w:val="18"/>
               </w:rPr>
-              <w:t>operador: inicia o SAFF Extractor e se autentica</w:t>
-            </w:r>
-          </w:p>
-        </w:tc>
-        <w:tc>
-          <w:p>
-            <w:r>
-              <w:rPr>
-                <w:sz w:val="18"/>
-              </w:rPr>
-              <w:t>SYSTEM exibe pagina que requisita dados do terminal</w:t>
+              <w:t>administrador: abre extrator</w:t>
+            </w:r>
+          </w:p>
+        </w:tc>
+        <w:tc>
+          <w:p>
+            <w:r>
+              <w:rPr>
+                <w:sz w:val="18"/>
+              </w:rPr>
+              <w:t>SYSTEM exibe tela de login</w:t>
             </w:r>
           </w:p>
         </w:tc>
@@ -229,39 +229,7 @@
               <w:rPr>
                 <w:sz w:val="18"/>
               </w:rPr>
-              <w:t>operador: abre extrator</w:t>
-            </w:r>
-          </w:p>
-        </w:tc>
-        <w:tc>
-          <w:p>
-            <w:r>
-              <w:rPr>
-                <w:sz w:val="18"/>
-              </w:rPr>
-              <w:t>SYSTEM exibe tela de login</w:t>
-            </w:r>
-          </w:p>
-        </w:tc>
-      </w:tr>
-      <w:tr>
-        <w:tc>
-          <w:p>
-            <w:r>
-              <w:rPr>
-                <w:sz w:val="18"/>
-              </w:rPr>
-              <w:t>3</w:t>
-            </w:r>
-          </w:p>
-        </w:tc>
-        <w:tc>
-          <w:p>
-            <w:r>
-              <w:rPr>
-                <w:sz w:val="18"/>
-              </w:rPr>
-              <w:t>operador: loga no extrator</w:t>
+              <w:t>administrador: loga no extrator</w:t>
             </w:r>
           </w:p>
         </w:tc>
@@ -310,7 +278,7 @@
         <w:rPr>
           <w:sz w:val="20"/>
         </w:rPr>
-        <w:t xml:space="preserve"> </w:t>
+        <w:t>Usuário está logado no servidor</w:t>
       </w:r>
     </w:p>
     <w:p>
@@ -328,7 +296,7 @@
         <w:rPr>
           <w:sz w:val="20"/>
         </w:rPr>
-        <w:t>extracoes foram realizadas (tempo de cada extracao deve ser o momento que esta foi feita em modo offline)</w:t>
+        <w:t/>
       </w:r>
     </w:p>
     <w:tbl>
@@ -419,17 +387,17 @@
               <w:rPr>
                 <w:sz w:val="18"/>
               </w:rPr>
-              <w:t>operador: inicia o SAFF Extractor e se autentica</w:t>
-            </w:r>
-          </w:p>
-        </w:tc>
-        <w:tc>
-          <w:p>
-            <w:r>
-              <w:rPr>
-                <w:sz w:val="18"/>
-              </w:rPr>
-              <w:t>SYSTEM exibe pagina que requisita dados do terminal</w:t>
+              <w:t>administrador: abre extrator</w:t>
+            </w:r>
+          </w:p>
+        </w:tc>
+        <w:tc>
+          <w:p>
+            <w:r>
+              <w:rPr>
+                <w:sz w:val="18"/>
+              </w:rPr>
+              <w:t>SYSTEM exibe tela de login</w:t>
             </w:r>
           </w:p>
         </w:tc>
@@ -451,17 +419,17 @@
               <w:rPr>
                 <w:sz w:val="18"/>
               </w:rPr>
-              <w:t>operador: abre extrator</w:t>
-            </w:r>
-          </w:p>
-        </w:tc>
-        <w:tc>
-          <w:p>
-            <w:r>
-              <w:rPr>
-                <w:sz w:val="18"/>
-              </w:rPr>
-              <w:t>SYSTEM exibe tela de login</w:t>
+              <w:t>administrador: define que o sistema sempre fará extrações offline</w:t>
+            </w:r>
+          </w:p>
+        </w:tc>
+        <w:tc>
+          <w:p>
+            <w:r>
+              <w:rPr>
+                <w:sz w:val="18"/>
+              </w:rPr>
+              <w:t>SYSTEM exibe tela inicial 'SAFF extraction'</w:t>
             </w:r>
           </w:p>
         </w:tc>
@@ -483,49 +451,17 @@
               <w:rPr>
                 <w:sz w:val="18"/>
               </w:rPr>
-              <w:t>operador: define que o sistema sempre fara extracoes offline</w:t>
-            </w:r>
-          </w:p>
-        </w:tc>
-        <w:tc>
-          <w:p>
-            <w:r>
-              <w:rPr>
-                <w:sz w:val="18"/>
-              </w:rPr>
-              <w:t>SYSTEM exibe pagina que requisita dados do terminal</w:t>
-            </w:r>
-          </w:p>
-        </w:tc>
-      </w:tr>
-      <w:tr>
-        <w:tc>
-          <w:p>
-            <w:r>
-              <w:rPr>
-                <w:sz w:val="18"/>
-              </w:rPr>
-              <w:t>4</w:t>
-            </w:r>
-          </w:p>
-        </w:tc>
-        <w:tc>
-          <w:p>
-            <w:r>
-              <w:rPr>
-                <w:sz w:val="18"/>
-              </w:rPr>
-              <w:t>operador: realiza uma serie de extracoes</w:t>
-            </w:r>
-          </w:p>
-        </w:tc>
-        <w:tc>
-          <w:p>
-            <w:r>
-              <w:rPr>
-                <w:sz w:val="18"/>
-              </w:rPr>
-              <w:t>SYSTEM salva as extracoes na pasta local 'OfflineExtraction'</w:t>
+              <w:t>administrador: realiza cinco extrações</w:t>
+            </w:r>
+          </w:p>
+        </w:tc>
+        <w:tc>
+          <w:p>
+            <w:r>
+              <w:rPr>
+                <w:sz w:val="18"/>
+              </w:rPr>
+              <w:t>SYSTEM adiciona novas extrações a pasta local'</w:t>
             </w:r>
           </w:p>
         </w:tc>
@@ -546,7 +482,7 @@
           <w:sz w:val="24"/>
           <w:color w:val="2B6CB0"/>
         </w:rPr>
-        <w:t xml:space="preserve">[TC3] Exception Flow 1: Sem conexao e usuario deseja entrar em modo offline </w:t>
+        <w:t xml:space="preserve">[TC3] Exception Flow 1: Cai conexão e usuario quer entrar em modo offline </w:t>
       </w:r>
     </w:p>
     <w:p>
@@ -564,7 +500,7 @@
         <w:rPr>
           <w:sz w:val="20"/>
         </w:rPr>
-        <w:t xml:space="preserve"> </w:t>
+        <w:t>Usuário está logado no servidor</w:t>
       </w:r>
     </w:p>
     <w:p>
@@ -673,17 +609,17 @@
               <w:rPr>
                 <w:sz w:val="18"/>
               </w:rPr>
-              <w:t>operador: inicia o SAFF Extractor e se autentica</w:t>
-            </w:r>
-          </w:p>
-        </w:tc>
-        <w:tc>
-          <w:p>
-            <w:r>
-              <w:rPr>
-                <w:sz w:val="18"/>
-              </w:rPr>
-              <w:t>SYSTEM exibe pagina que requisita dados do terminal</w:t>
+              <w:t>administrador: abre extrator</w:t>
+            </w:r>
+          </w:p>
+        </w:tc>
+        <w:tc>
+          <w:p>
+            <w:r>
+              <w:rPr>
+                <w:sz w:val="18"/>
+              </w:rPr>
+              <w:t>SYSTEM exibe tela de login</w:t>
             </w:r>
           </w:p>
         </w:tc>
@@ -705,17 +641,17 @@
               <w:rPr>
                 <w:sz w:val="18"/>
               </w:rPr>
-              <w:t>operador: abre extrator</w:t>
-            </w:r>
-          </w:p>
-        </w:tc>
-        <w:tc>
-          <w:p>
-            <w:r>
-              <w:rPr>
-                <w:sz w:val="18"/>
-              </w:rPr>
-              <w:t>SYSTEM exibe tela de login</w:t>
+              <w:t>administrador: loga no extrator</w:t>
+            </w:r>
+          </w:p>
+        </w:tc>
+        <w:tc>
+          <w:p>
+            <w:r>
+              <w:rPr>
+                <w:sz w:val="18"/>
+              </w:rPr>
+              <w:t>SYSTEM exibe mensagem solicitando confirmação se usuario quer entrar em modo offline</w:t>
             </w:r>
           </w:p>
         </w:tc>
@@ -737,17 +673,17 @@
               <w:rPr>
                 <w:sz w:val="18"/>
               </w:rPr>
-              <w:t>operador: loga no extrator</w:t>
-            </w:r>
-          </w:p>
-        </w:tc>
-        <w:tc>
-          <w:p>
-            <w:r>
-              <w:rPr>
-                <w:sz w:val="18"/>
-              </w:rPr>
-              <w:t>SYSTEM exibe mensagem solicitando confirmacao se usuario quer entrar em modo offline</w:t>
+              <w:t>administrador: confirma que quer entrar em modo offline</w:t>
+            </w:r>
+          </w:p>
+        </w:tc>
+        <w:tc>
+          <w:p>
+            <w:r>
+              <w:rPr>
+                <w:sz w:val="18"/>
+              </w:rPr>
+              <w:t>SYSTEM exibe tela inicial 'SAFF extraction'</w:t>
             </w:r>
           </w:p>
         </w:tc>
@@ -769,17 +705,17 @@
               <w:rPr>
                 <w:sz w:val="18"/>
               </w:rPr>
-              <w:t>operador: confirma que quer entrar em modo offline</w:t>
-            </w:r>
-          </w:p>
-        </w:tc>
-        <w:tc>
-          <w:p>
-            <w:r>
-              <w:rPr>
-                <w:sz w:val="18"/>
-              </w:rPr>
-              <w:t>SYSTEM exibe pagina que requisita dados do terminal</w:t>
+              <w:t>administrador: realiza cinco extrações</w:t>
+            </w:r>
+          </w:p>
+        </w:tc>
+        <w:tc>
+          <w:p>
+            <w:r>
+              <w:rPr>
+                <w:sz w:val="18"/>
+              </w:rPr>
+              <w:t>SYSTEM adiciona novas extrações a pasta local'</w:t>
             </w:r>
           </w:p>
         </w:tc>
@@ -801,17 +737,17 @@
               <w:rPr>
                 <w:sz w:val="18"/>
               </w:rPr>
-              <w:t>operador: realiza uma serie de extracoes sequenciais</w:t>
-            </w:r>
-          </w:p>
-        </w:tc>
-        <w:tc>
-          <w:p>
-            <w:r>
-              <w:rPr>
-                <w:sz w:val="18"/>
-              </w:rPr>
-              <w:t>SYSTEM salva as extracoes na pasta local 'OfflineExtraction'</w:t>
+              <w:t>administrador: reastabelece conexão</w:t>
+            </w:r>
+          </w:p>
+        </w:tc>
+        <w:tc>
+          <w:p>
+            <w:r>
+              <w:rPr>
+                <w:sz w:val="18"/>
+              </w:rPr>
+              <w:t>SYSTEM envia extrações locais para o servidor e as apaga da pasta local</w:t>
             </w:r>
           </w:p>
         </w:tc>
@@ -833,49 +769,17 @@
               <w:rPr>
                 <w:sz w:val="18"/>
               </w:rPr>
-              <w:t>operador: reastabelece conexao</w:t>
-            </w:r>
-          </w:p>
-        </w:tc>
-        <w:tc>
-          <w:p>
-            <w:r>
-              <w:rPr>
-                <w:sz w:val="18"/>
-              </w:rPr>
-              <w:t>SYSTEM envia extracoes locais para o servidor e as apaga da pasta local 'OfflineExtraction'</w:t>
-            </w:r>
-          </w:p>
-        </w:tc>
-      </w:tr>
-      <w:tr>
-        <w:tc>
-          <w:p>
-            <w:r>
-              <w:rPr>
-                <w:sz w:val="18"/>
-              </w:rPr>
-              <w:t>7</w:t>
-            </w:r>
-          </w:p>
-        </w:tc>
-        <w:tc>
-          <w:p>
-            <w:r>
-              <w:rPr>
-                <w:sz w:val="18"/>
-              </w:rPr>
-              <w:t>operador: loga no servidor e vai ate a pagina de extracoes</w:t>
-            </w:r>
-          </w:p>
-        </w:tc>
-        <w:tc>
-          <w:p>
-            <w:r>
-              <w:rPr>
-                <w:sz w:val="18"/>
-              </w:rPr>
-              <w:t>SYSTEM exibe lista com extracoes realizadas no modo offline</w:t>
+              <w:t>administrador: loga no servidor e vai até a página de extrações</w:t>
+            </w:r>
+          </w:p>
+        </w:tc>
+        <w:tc>
+          <w:p>
+            <w:r>
+              <w:rPr>
+                <w:sz w:val="18"/>
+              </w:rPr>
+              <w:t>SYSTEM exibe lista com extrações realizada no modo offline no topo</w:t>
             </w:r>
           </w:p>
         </w:tc>
@@ -896,7 +800,7 @@
           <w:sz w:val="24"/>
           <w:color w:val="2B6CB0"/>
         </w:rPr>
-        <w:t xml:space="preserve">[TC4] Exception Flow 2: Sem conexao e usuario nao deseja entrar em modo offline </w:t>
+        <w:t xml:space="preserve">[TC4] Exception Flow 2: Cai conexão e usuario nao quer entrar em modo offline </w:t>
       </w:r>
     </w:p>
     <w:p>
@@ -914,7 +818,7 @@
         <w:rPr>
           <w:sz w:val="20"/>
         </w:rPr>
-        <w:t xml:space="preserve"> </w:t>
+        <w:t>Usuário está logado no servidor</w:t>
       </w:r>
     </w:p>
     <w:p>
@@ -1023,17 +927,17 @@
               <w:rPr>
                 <w:sz w:val="18"/>
               </w:rPr>
-              <w:t>operador: inicia o SAFF Extractor e se autentica</w:t>
-            </w:r>
-          </w:p>
-        </w:tc>
-        <w:tc>
-          <w:p>
-            <w:r>
-              <w:rPr>
-                <w:sz w:val="18"/>
-              </w:rPr>
-              <w:t>SYSTEM exibe pagina que requisita dados do terminal</w:t>
+              <w:t>administrador: abre extrator</w:t>
+            </w:r>
+          </w:p>
+        </w:tc>
+        <w:tc>
+          <w:p>
+            <w:r>
+              <w:rPr>
+                <w:sz w:val="18"/>
+              </w:rPr>
+              <w:t>SYSTEM exibe tela de login</w:t>
             </w:r>
           </w:p>
         </w:tc>
@@ -1055,17 +959,17 @@
               <w:rPr>
                 <w:sz w:val="18"/>
               </w:rPr>
-              <w:t>operador: abre extrator</w:t>
-            </w:r>
-          </w:p>
-        </w:tc>
-        <w:tc>
-          <w:p>
-            <w:r>
-              <w:rPr>
-                <w:sz w:val="18"/>
-              </w:rPr>
-              <w:t>SYSTEM exibe tela de login</w:t>
+              <w:t>administrador: loga no extrator</w:t>
+            </w:r>
+          </w:p>
+        </w:tc>
+        <w:tc>
+          <w:p>
+            <w:r>
+              <w:rPr>
+                <w:sz w:val="18"/>
+              </w:rPr>
+              <w:t>SYSTEM exibe mensagem solicitando confirmação se usuario quer entrar em modo offline</w:t>
             </w:r>
           </w:p>
         </w:tc>
@@ -1087,39 +991,7 @@
               <w:rPr>
                 <w:sz w:val="18"/>
               </w:rPr>
-              <w:t>operador: loga no extrator</w:t>
-            </w:r>
-          </w:p>
-        </w:tc>
-        <w:tc>
-          <w:p>
-            <w:r>
-              <w:rPr>
-                <w:sz w:val="18"/>
-              </w:rPr>
-              <w:t>SYSTEM exibe mensagem solicitando confirmação se usuario quer entrar em modo offline</w:t>
-            </w:r>
-          </w:p>
-        </w:tc>
-      </w:tr>
-      <w:tr>
-        <w:tc>
-          <w:p>
-            <w:r>
-              <w:rPr>
-                <w:sz w:val="18"/>
-              </w:rPr>
-              <w:t>4</w:t>
-            </w:r>
-          </w:p>
-        </w:tc>
-        <w:tc>
-          <w:p>
-            <w:r>
-              <w:rPr>
-                <w:sz w:val="18"/>
-              </w:rPr>
-              <w:t>operador: nao deseja entrar em modo offline</w:t>
+              <w:t>administrador: não deseja entrar em modo offline</w:t>
             </w:r>
           </w:p>
         </w:tc>
@@ -1130,228 +1002,6 @@
                 <w:sz w:val="18"/>
               </w:rPr>
               <w:t>SYSTEM processes action successfully</w:t>
-            </w:r>
-          </w:p>
-        </w:tc>
-      </w:tr>
-    </w:tbl>
-    <w:p>
-      <w:r>
-        <w:br/>
-      </w:r>
-    </w:p>
-    <w:p>
-      <w:pPr>
-        <w:spacing w:before="180" w:after="60"/>
-      </w:pPr>
-      <w:r>
-        <w:rPr>
-          <w:b w:val="on"/>
-          <w:sz w:val="24"/>
-          <w:color w:val="2B6CB0"/>
-        </w:rPr>
-        <w:t>[TC5] Exception Flow 3: Cai conexao novamente</w:t>
-      </w:r>
-    </w:p>
-    <w:p>
-      <w:pPr>
-        <w:spacing w:after="40"/>
-      </w:pPr>
-      <w:r>
-        <w:rPr>
-          <w:b w:val="on"/>
-          <w:sz w:val="20"/>
-        </w:rPr>
-        <w:t xml:space="preserve">Preconditions: </w:t>
-      </w:r>
-      <w:r>
-        <w:rPr>
-          <w:sz w:val="20"/>
-        </w:rPr>
-        <w:t xml:space="preserve"> </w:t>
-      </w:r>
-    </w:p>
-    <w:p>
-      <w:pPr>
-        <w:spacing w:after="40"/>
-      </w:pPr>
-      <w:r>
-        <w:rPr>
-          <w:b w:val="on"/>
-          <w:sz w:val="20"/>
-        </w:rPr>
-        <w:t xml:space="preserve">Postconditions: </w:t>
-      </w:r>
-      <w:r>
-        <w:rPr>
-          <w:sz w:val="20"/>
-        </w:rPr>
-        <w:t>Flow interrupted due to exception / error</w:t>
-      </w:r>
-    </w:p>
-    <w:tbl>
-      <w:tblPr>
-        <w:tblW w:w="5000" w:type="pct"/>
-        <w:tblBorders>
-          <w:top w:val="single"/>
-          <w:left w:val="single"/>
-          <w:bottom w:val="single"/>
-          <w:right w:val="single"/>
-          <w:insideH w:val="single"/>
-          <w:insideV w:val="single"/>
-        </w:tblBorders>
-      </w:tblPr>
-      <w:tr>
-        <w:tc>
-          <w:tcPr>
-            <w:tcW w:w="1200" w:type="dxa"/>
-            <w:shd w:color="auto" w:val="clear" w:fill="2B6CB0"/>
-          </w:tcPr>
-          <w:p>
-            <w:pPr>
-              <w:jc w:val="left"/>
-            </w:pPr>
-            <w:r>
-              <w:rPr>
-                <w:b w:val="on"/>
-                <w:sz w:val="20"/>
-                <w:color w:val="FFFFFF"/>
-              </w:rPr>
-              <w:t>Step #</w:t>
-            </w:r>
-          </w:p>
-        </w:tc>
-        <w:tc>
-          <w:tcPr>
-            <w:tcW w:w="4500" w:type="dxa"/>
-            <w:shd w:color="auto" w:val="clear" w:fill="2B6CB0"/>
-          </w:tcPr>
-          <w:p>
-            <w:pPr>
-              <w:jc w:val="left"/>
-            </w:pPr>
-            <w:r>
-              <w:rPr>
-                <w:b w:val="on"/>
-                <w:sz w:val="20"/>
-                <w:color w:val="FFFFFF"/>
-              </w:rPr>
-              <w:t>Actor Action</w:t>
-            </w:r>
-          </w:p>
-        </w:tc>
-        <w:tc>
-          <w:tcPr>
-            <w:tcW w:w="4500" w:type="dxa"/>
-            <w:shd w:color="auto" w:val="clear" w:fill="2B6CB0"/>
-          </w:tcPr>
-          <w:p>
-            <w:pPr>
-              <w:jc w:val="left"/>
-            </w:pPr>
-            <w:r>
-              <w:rPr>
-                <w:b w:val="on"/>
-                <w:sz w:val="20"/>
-                <w:color w:val="FFFFFF"/>
-              </w:rPr>
-              <w:t>Expected Result (System)</w:t>
-            </w:r>
-          </w:p>
-        </w:tc>
-      </w:tr>
-      <w:tr>
-        <w:tc>
-          <w:p>
-            <w:r>
-              <w:rPr>
-                <w:sz w:val="18"/>
-              </w:rPr>
-              <w:t>1</w:t>
-            </w:r>
-          </w:p>
-        </w:tc>
-        <w:tc>
-          <w:p>
-            <w:r>
-              <w:rPr>
-                <w:sz w:val="18"/>
-              </w:rPr>
-              <w:t>system: SYSTEM: mantem informacao das extracoes nao enviadas a tempo na pasta local</w:t>
-            </w:r>
-          </w:p>
-        </w:tc>
-        <w:tc>
-          <w:p>
-            <w:r>
-              <w:rPr>
-                <w:sz w:val="18"/>
-              </w:rPr>
-              <w:t>mantem informacao das extracoes nao enviadas a tempo na pasta local</w:t>
-            </w:r>
-          </w:p>
-        </w:tc>
-      </w:tr>
-      <w:tr>
-        <w:tc>
-          <w:p>
-            <w:r>
-              <w:rPr>
-                <w:sz w:val="18"/>
-              </w:rPr>
-              <w:t>2</w:t>
-            </w:r>
-          </w:p>
-        </w:tc>
-        <w:tc>
-          <w:p>
-            <w:r>
-              <w:rPr>
-                <w:sz w:val="18"/>
-              </w:rPr>
-              <w:t>operador: reastabelece conexao</w:t>
-            </w:r>
-          </w:p>
-        </w:tc>
-        <w:tc>
-          <w:p>
-            <w:r>
-              <w:rPr>
-                <w:sz w:val="18"/>
-              </w:rPr>
-              <w:t>SYSTEM envia extracoes restantes da pasta local para o servidor e as apaga da pasta 'OfflineExtraction'</w:t>
-            </w:r>
-          </w:p>
-        </w:tc>
-      </w:tr>
-      <w:tr>
-        <w:tc>
-          <w:p>
-            <w:r>
-              <w:rPr>
-                <w:sz w:val="18"/>
-              </w:rPr>
-              <w:t>3</w:t>
-            </w:r>
-          </w:p>
-        </w:tc>
-        <w:tc>
-          <w:p>
-            <w:r>
-              <w:rPr>
-                <w:sz w:val="18"/>
-              </w:rPr>
-              <w:t>operador: loga no servidor e vai ate a pagina de extracoes</w:t>
-            </w:r>
-          </w:p>
-        </w:tc>
-        <w:tc>
-          <w:p>
-            <w:r>
-              <w:rPr>
-                <w:sz w:val="18"/>
-              </w:rPr>
-              <w:t>SYSTEM exibe lista que contem as extracoes realizadas no modo offline</w:t>
             </w:r>
           </w:p>
         </w:tc>

</xml_diff>

<commit_message>
feat(saff-study): publish specification and test suite v2.6
</commit_message>
<xml_diff>
--- a/output/docx/ExtracaoOffline.docx
+++ b/output/docx/ExtracaoOffline.docx
@@ -88,7 +88,7 @@
         <w:rPr>
           <w:sz w:val="20"/>
         </w:rPr>
-        <w:t>Usuário está logado no servidor</w:t>
+        <w:t>Usuário não está logado no servidor</w:t>
       </w:r>
     </w:p>
     <w:p>
@@ -207,7 +207,135 @@
               <w:rPr>
                 <w:sz w:val="18"/>
               </w:rPr>
+              <w:t>SYSTEM exibe exibe mensagem perguntando se o usuário deseja entrar em modo offline</w:t>
+            </w:r>
+          </w:p>
+        </w:tc>
+      </w:tr>
+      <w:tr>
+        <w:tc>
+          <w:p>
+            <w:r>
+              <w:rPr>
+                <w:sz w:val="18"/>
+              </w:rPr>
+              <w:t>2</w:t>
+            </w:r>
+          </w:p>
+        </w:tc>
+        <w:tc>
+          <w:p>
+            <w:r>
+              <w:rPr>
+                <w:sz w:val="18"/>
+              </w:rPr>
+              <w:t>administrador: pressiona botão Yes</w:t>
+            </w:r>
+          </w:p>
+        </w:tc>
+        <w:tc>
+          <w:p>
+            <w:r>
+              <w:rPr>
+                <w:sz w:val="18"/>
+              </w:rPr>
               <w:t>SYSTEM exibe tela inicial 'SAFF extraction'</w:t>
+            </w:r>
+          </w:p>
+        </w:tc>
+      </w:tr>
+      <w:tr>
+        <w:tc>
+          <w:p>
+            <w:r>
+              <w:rPr>
+                <w:sz w:val="18"/>
+              </w:rPr>
+              <w:t>3</w:t>
+            </w:r>
+          </w:p>
+        </w:tc>
+        <w:tc>
+          <w:p>
+            <w:r>
+              <w:rPr>
+                <w:sz w:val="18"/>
+              </w:rPr>
+              <w:t>administrador: insere um 'Product number', 'Serial number', tipo de teste 'Pre_test' e pressiona 'Extract'</w:t>
+            </w:r>
+          </w:p>
+        </w:tc>
+        <w:tc>
+          <w:p>
+            <w:r>
+              <w:rPr>
+                <w:sz w:val="18"/>
+              </w:rPr>
+              <w:t>SYSTEM adiciona nova extração a pasta local'</w:t>
+            </w:r>
+          </w:p>
+        </w:tc>
+      </w:tr>
+      <w:tr>
+        <w:tc>
+          <w:p>
+            <w:r>
+              <w:rPr>
+                <w:sz w:val="18"/>
+              </w:rPr>
+              <w:t>4</w:t>
+            </w:r>
+          </w:p>
+        </w:tc>
+        <w:tc>
+          <w:p>
+            <w:r>
+              <w:rPr>
+                <w:sz w:val="18"/>
+              </w:rPr>
+              <w:t>administrador: loga no servidor</w:t>
+            </w:r>
+          </w:p>
+        </w:tc>
+        <w:tc>
+          <w:p>
+            <w:r>
+              <w:rPr>
+                <w:sz w:val="18"/>
+              </w:rPr>
+              <w:t>SYSTEM envia extrações da pasta local para o servidor e as deleta da máquina local</w:t>
+            </w:r>
+          </w:p>
+        </w:tc>
+      </w:tr>
+      <w:tr>
+        <w:tc>
+          <w:p>
+            <w:r>
+              <w:rPr>
+                <w:sz w:val="18"/>
+              </w:rPr>
+              <w:t>5</w:t>
+            </w:r>
+          </w:p>
+        </w:tc>
+        <w:tc>
+          <w:p>
+            <w:r>
+              <w:rPr>
+                <w:sz w:val="18"/>
+              </w:rPr>
+              <w:t>administrador: vai até a página de extrações</w:t>
+            </w:r>
+          </w:p>
+        </w:tc>
+        <w:tc>
+          <w:p>
+            <w:r>
+              <w:rPr>
+                <w:sz w:val="18"/>
+              </w:rPr>
+              <w:t>SYSTEM exibe lista com a extração realizada no modo offline no topo</w:t>
             </w:r>
           </w:p>
         </w:tc>
@@ -246,7 +374,7 @@
         <w:rPr>
           <w:sz w:val="20"/>
         </w:rPr>
-        <w:t>Usuário está logado no servidor</w:t>
+        <w:t>Usuário não está logado no servidor</w:t>
       </w:r>
     </w:p>
     <w:p>
@@ -355,7 +483,103 @@
               <w:rPr>
                 <w:sz w:val="18"/>
               </w:rPr>
-              <w:t>administrador: Não deseja entrar em modo offline</w:t>
+              <w:t>administrador: loga no extrator</w:t>
+            </w:r>
+          </w:p>
+        </w:tc>
+        <w:tc>
+          <w:p>
+            <w:r>
+              <w:rPr>
+                <w:sz w:val="18"/>
+              </w:rPr>
+              <w:t>SYSTEM exibe exibe mensagem perguntando se o usuário deseja entrar em modo offline</w:t>
+            </w:r>
+          </w:p>
+        </w:tc>
+      </w:tr>
+      <w:tr>
+        <w:tc>
+          <w:p>
+            <w:r>
+              <w:rPr>
+                <w:sz w:val="18"/>
+              </w:rPr>
+              <w:t>2</w:t>
+            </w:r>
+          </w:p>
+        </w:tc>
+        <w:tc>
+          <w:p>
+            <w:r>
+              <w:rPr>
+                <w:sz w:val="18"/>
+              </w:rPr>
+              <w:t>administrador: pressiona botão No</w:t>
+            </w:r>
+          </w:p>
+        </w:tc>
+        <w:tc>
+          <w:p>
+            <w:r>
+              <w:rPr>
+                <w:sz w:val="18"/>
+              </w:rPr>
+              <w:t>SYSTEM Fecha janela de mensagem</w:t>
+            </w:r>
+          </w:p>
+        </w:tc>
+      </w:tr>
+      <w:tr>
+        <w:tc>
+          <w:p>
+            <w:r>
+              <w:rPr>
+                <w:sz w:val="18"/>
+              </w:rPr>
+              <w:t>3</w:t>
+            </w:r>
+          </w:p>
+        </w:tc>
+        <w:tc>
+          <w:p>
+            <w:r>
+              <w:rPr>
+                <w:sz w:val="18"/>
+              </w:rPr>
+              <w:t>administrador: loga no extrator</w:t>
+            </w:r>
+          </w:p>
+        </w:tc>
+        <w:tc>
+          <w:p>
+            <w:r>
+              <w:rPr>
+                <w:sz w:val="18"/>
+              </w:rPr>
+              <w:t>SYSTEM exibe exibe mensagem perguntando se o usuário deseja entrar em modo offline</w:t>
+            </w:r>
+          </w:p>
+        </w:tc>
+      </w:tr>
+      <w:tr>
+        <w:tc>
+          <w:p>
+            <w:r>
+              <w:rPr>
+                <w:sz w:val="18"/>
+              </w:rPr>
+              <w:t>4</w:t>
+            </w:r>
+          </w:p>
+        </w:tc>
+        <w:tc>
+          <w:p>
+            <w:r>
+              <w:rPr>
+                <w:sz w:val="18"/>
+              </w:rPr>
+              <w:t>administrador: pressiona botão Yes</w:t>
             </w:r>
           </w:p>
         </w:tc>
@@ -366,6 +590,102 @@
                 <w:sz w:val="18"/>
               </w:rPr>
               <w:t>SYSTEM exibe tela inicial 'SAFF extraction'</w:t>
+            </w:r>
+          </w:p>
+        </w:tc>
+      </w:tr>
+      <w:tr>
+        <w:tc>
+          <w:p>
+            <w:r>
+              <w:rPr>
+                <w:sz w:val="18"/>
+              </w:rPr>
+              <w:t>5</w:t>
+            </w:r>
+          </w:p>
+        </w:tc>
+        <w:tc>
+          <w:p>
+            <w:r>
+              <w:rPr>
+                <w:sz w:val="18"/>
+              </w:rPr>
+              <w:t>administrador: insere um 'Product number', 'Serial number', tipo de teste 'Pre_test' e pressiona 'Extract'</w:t>
+            </w:r>
+          </w:p>
+        </w:tc>
+        <w:tc>
+          <w:p>
+            <w:r>
+              <w:rPr>
+                <w:sz w:val="18"/>
+              </w:rPr>
+              <w:t>SYSTEM adiciona nova extração a pasta local'</w:t>
+            </w:r>
+          </w:p>
+        </w:tc>
+      </w:tr>
+      <w:tr>
+        <w:tc>
+          <w:p>
+            <w:r>
+              <w:rPr>
+                <w:sz w:val="18"/>
+              </w:rPr>
+              <w:t>6</w:t>
+            </w:r>
+          </w:p>
+        </w:tc>
+        <w:tc>
+          <w:p>
+            <w:r>
+              <w:rPr>
+                <w:sz w:val="18"/>
+              </w:rPr>
+              <w:t>administrador: loga no servidor</w:t>
+            </w:r>
+          </w:p>
+        </w:tc>
+        <w:tc>
+          <w:p>
+            <w:r>
+              <w:rPr>
+                <w:sz w:val="18"/>
+              </w:rPr>
+              <w:t>SYSTEM envia extrações da pasta local para o servidor e as deleta da máquina local</w:t>
+            </w:r>
+          </w:p>
+        </w:tc>
+      </w:tr>
+      <w:tr>
+        <w:tc>
+          <w:p>
+            <w:r>
+              <w:rPr>
+                <w:sz w:val="18"/>
+              </w:rPr>
+              <w:t>7</w:t>
+            </w:r>
+          </w:p>
+        </w:tc>
+        <w:tc>
+          <w:p>
+            <w:r>
+              <w:rPr>
+                <w:sz w:val="18"/>
+              </w:rPr>
+              <w:t>administrador: vai até a página de extrações</w:t>
+            </w:r>
+          </w:p>
+        </w:tc>
+        <w:tc>
+          <w:p>
+            <w:r>
+              <w:rPr>
+                <w:sz w:val="18"/>
+              </w:rPr>
+              <w:t>SYSTEM exibe lista com a extração realizada no modo offline no topo</w:t>
             </w:r>
           </w:p>
         </w:tc>
@@ -386,7 +706,7 @@
           <w:sz w:val="24"/>
           <w:color w:val="2B6CB0"/>
         </w:rPr>
-        <w:t>[TC3] Alternative Flow 2: Offline sempre</w:t>
+        <w:t>[TC3] Alternative Flow 2: Test 1</w:t>
       </w:r>
     </w:p>
     <w:p>
@@ -404,7 +724,7 @@
         <w:rPr>
           <w:sz w:val="20"/>
         </w:rPr>
-        <w:t>Usuário está logado no servidor</w:t>
+        <w:t>Usuário não está logado no servidor</w:t>
       </w:r>
     </w:p>
     <w:p>
@@ -513,7 +833,39 @@
               <w:rPr>
                 <w:sz w:val="18"/>
               </w:rPr>
-              <w:t>administrador: define que o sistema sempre fará extrações offline</w:t>
+              <w:t>administrador: loga no extrator</w:t>
+            </w:r>
+          </w:p>
+        </w:tc>
+        <w:tc>
+          <w:p>
+            <w:r>
+              <w:rPr>
+                <w:sz w:val="18"/>
+              </w:rPr>
+              <w:t>SYSTEM exibe exibe mensagem perguntando se o usuário deseja entrar em modo offline</w:t>
+            </w:r>
+          </w:p>
+        </w:tc>
+      </w:tr>
+      <w:tr>
+        <w:tc>
+          <w:p>
+            <w:r>
+              <w:rPr>
+                <w:sz w:val="18"/>
+              </w:rPr>
+              <w:t>2</w:t>
+            </w:r>
+          </w:p>
+        </w:tc>
+        <w:tc>
+          <w:p>
+            <w:r>
+              <w:rPr>
+                <w:sz w:val="18"/>
+              </w:rPr>
+              <w:t>administrador: pressiona botão Yes</w:t>
             </w:r>
           </w:p>
         </w:tc>
@@ -535,27 +887,91 @@
               <w:rPr>
                 <w:sz w:val="18"/>
               </w:rPr>
-              <w:t>2</w:t>
-            </w:r>
-          </w:p>
-        </w:tc>
-        <w:tc>
-          <w:p>
-            <w:r>
-              <w:rPr>
-                <w:sz w:val="18"/>
-              </w:rPr>
-              <w:t>administrador: realiza cinco extrações</w:t>
-            </w:r>
-          </w:p>
-        </w:tc>
-        <w:tc>
-          <w:p>
-            <w:r>
-              <w:rPr>
-                <w:sz w:val="18"/>
-              </w:rPr>
-              <w:t>SYSTEM adiciona novas extrações a pasta local'</w:t>
+              <w:t>3</w:t>
+            </w:r>
+          </w:p>
+        </w:tc>
+        <w:tc>
+          <w:p>
+            <w:r>
+              <w:rPr>
+                <w:sz w:val="18"/>
+              </w:rPr>
+              <w:t>administrador: insere um 'Product number', 'Serial number', tipo de teste 'Test 1' e pressiona 'Extract'</w:t>
+            </w:r>
+          </w:p>
+        </w:tc>
+        <w:tc>
+          <w:p>
+            <w:r>
+              <w:rPr>
+                <w:sz w:val="18"/>
+              </w:rPr>
+              <w:t>SYSTEM adiciona nova extração a pasta local'</w:t>
+            </w:r>
+          </w:p>
+        </w:tc>
+      </w:tr>
+      <w:tr>
+        <w:tc>
+          <w:p>
+            <w:r>
+              <w:rPr>
+                <w:sz w:val="18"/>
+              </w:rPr>
+              <w:t>4</w:t>
+            </w:r>
+          </w:p>
+        </w:tc>
+        <w:tc>
+          <w:p>
+            <w:r>
+              <w:rPr>
+                <w:sz w:val="18"/>
+              </w:rPr>
+              <w:t>administrador: loga no servidor</w:t>
+            </w:r>
+          </w:p>
+        </w:tc>
+        <w:tc>
+          <w:p>
+            <w:r>
+              <w:rPr>
+                <w:sz w:val="18"/>
+              </w:rPr>
+              <w:t>SYSTEM envia extrações da pasta local para o servidor e as deleta da máquina local</w:t>
+            </w:r>
+          </w:p>
+        </w:tc>
+      </w:tr>
+      <w:tr>
+        <w:tc>
+          <w:p>
+            <w:r>
+              <w:rPr>
+                <w:sz w:val="18"/>
+              </w:rPr>
+              <w:t>5</w:t>
+            </w:r>
+          </w:p>
+        </w:tc>
+        <w:tc>
+          <w:p>
+            <w:r>
+              <w:rPr>
+                <w:sz w:val="18"/>
+              </w:rPr>
+              <w:t>administrador: vai até a página de extrações</w:t>
+            </w:r>
+          </w:p>
+        </w:tc>
+        <w:tc>
+          <w:p>
+            <w:r>
+              <w:rPr>
+                <w:sz w:val="18"/>
+              </w:rPr>
+              <w:t>SYSTEM exibe lista com a extração realizada no modo offline no topo</w:t>
             </w:r>
           </w:p>
         </w:tc>
@@ -576,7 +992,7 @@
           <w:sz w:val="24"/>
           <w:color w:val="2B6CB0"/>
         </w:rPr>
-        <w:t xml:space="preserve">[TC4] Exception Flow 1: Cai conexão </w:t>
+        <w:t>[TC4] Alternative Flow 3: Test 2</w:t>
       </w:r>
     </w:p>
     <w:p>
@@ -594,7 +1010,7 @@
         <w:rPr>
           <w:sz w:val="20"/>
         </w:rPr>
-        <w:t>Usuário está logado no servidor</w:t>
+        <w:t>Usuário não está logado no servidor</w:t>
       </w:r>
     </w:p>
     <w:p>
@@ -612,7 +1028,7 @@
         <w:rPr>
           <w:sz w:val="20"/>
         </w:rPr>
-        <w:t>Flow interrupted due to exception / error</w:t>
+        <w:t/>
       </w:r>
     </w:p>
     <w:tbl>
@@ -713,7 +1129,7 @@
               <w:rPr>
                 <w:sz w:val="18"/>
               </w:rPr>
-              <w:t>SYSTEM processes action successfully</w:t>
+              <w:t>SYSTEM exibe exibe mensagem perguntando se o usuário deseja entrar em modo offline</w:t>
             </w:r>
           </w:p>
         </w:tc>
@@ -735,7 +1151,7 @@
               <w:rPr>
                 <w:sz w:val="18"/>
               </w:rPr>
-              <w:t>administrador: confirma que quer entrar em modo offline</w:t>
+              <w:t>administrador: pressiona botão Yes</w:t>
             </w:r>
           </w:p>
         </w:tc>
@@ -767,17 +1183,17 @@
               <w:rPr>
                 <w:sz w:val="18"/>
               </w:rPr>
-              <w:t>administrador: realiza cinco extrações</w:t>
-            </w:r>
-          </w:p>
-        </w:tc>
-        <w:tc>
-          <w:p>
-            <w:r>
-              <w:rPr>
-                <w:sz w:val="18"/>
-              </w:rPr>
-              <w:t>SYSTEM adiciona novas extrações a pasta local'</w:t>
+              <w:t>administrador: insere um 'Product number', 'Serial number', tipo de teste 'Test 2' e pressiona 'Extract'</w:t>
+            </w:r>
+          </w:p>
+        </w:tc>
+        <w:tc>
+          <w:p>
+            <w:r>
+              <w:rPr>
+                <w:sz w:val="18"/>
+              </w:rPr>
+              <w:t>SYSTEM adiciona nova extração a pasta local'</w:t>
             </w:r>
           </w:p>
         </w:tc>
@@ -799,17 +1215,17 @@
               <w:rPr>
                 <w:sz w:val="18"/>
               </w:rPr>
-              <w:t>administrador: reastabelece conexão</w:t>
-            </w:r>
-          </w:p>
-        </w:tc>
-        <w:tc>
-          <w:p>
-            <w:r>
-              <w:rPr>
-                <w:sz w:val="18"/>
-              </w:rPr>
-              <w:t>SYSTEM envia extrações locais para o servidor e as apaga da pasta local</w:t>
+              <w:t>administrador: loga no servidor</w:t>
+            </w:r>
+          </w:p>
+        </w:tc>
+        <w:tc>
+          <w:p>
+            <w:r>
+              <w:rPr>
+                <w:sz w:val="18"/>
+              </w:rPr>
+              <w:t>SYSTEM envia extrações da pasta local para o servidor e as deleta da máquina local</w:t>
             </w:r>
           </w:p>
         </w:tc>
@@ -831,17 +1247,875 @@
               <w:rPr>
                 <w:sz w:val="18"/>
               </w:rPr>
-              <w:t>administrador: loga no servidor e vai até a página de extrações</w:t>
-            </w:r>
-          </w:p>
-        </w:tc>
-        <w:tc>
-          <w:p>
-            <w:r>
-              <w:rPr>
-                <w:sz w:val="18"/>
-              </w:rPr>
-              <w:t>SYSTEM exibe lista com extrações realizada no modo offline no topo</w:t>
+              <w:t>administrador: vai até a página de extrações</w:t>
+            </w:r>
+          </w:p>
+        </w:tc>
+        <w:tc>
+          <w:p>
+            <w:r>
+              <w:rPr>
+                <w:sz w:val="18"/>
+              </w:rPr>
+              <w:t>SYSTEM exibe lista com a extração realizada no modo offline no topo</w:t>
+            </w:r>
+          </w:p>
+        </w:tc>
+      </w:tr>
+    </w:tbl>
+    <w:p>
+      <w:r>
+        <w:br/>
+      </w:r>
+    </w:p>
+    <w:p>
+      <w:pPr>
+        <w:spacing w:before="180" w:after="60"/>
+      </w:pPr>
+      <w:r>
+        <w:rPr>
+          <w:b w:val="on"/>
+          <w:sz w:val="24"/>
+          <w:color w:val="2B6CB0"/>
+        </w:rPr>
+        <w:t>[TC5] Alternative Flow 4: QA</w:t>
+      </w:r>
+    </w:p>
+    <w:p>
+      <w:pPr>
+        <w:spacing w:after="40"/>
+      </w:pPr>
+      <w:r>
+        <w:rPr>
+          <w:b w:val="on"/>
+          <w:sz w:val="20"/>
+        </w:rPr>
+        <w:t xml:space="preserve">Preconditions: </w:t>
+      </w:r>
+      <w:r>
+        <w:rPr>
+          <w:sz w:val="20"/>
+        </w:rPr>
+        <w:t>Usuário não está logado no servidor</w:t>
+      </w:r>
+    </w:p>
+    <w:p>
+      <w:pPr>
+        <w:spacing w:after="40"/>
+      </w:pPr>
+      <w:r>
+        <w:rPr>
+          <w:b w:val="on"/>
+          <w:sz w:val="20"/>
+        </w:rPr>
+        <w:t xml:space="preserve">Postconditions: </w:t>
+      </w:r>
+      <w:r>
+        <w:rPr>
+          <w:sz w:val="20"/>
+        </w:rPr>
+        <w:t/>
+      </w:r>
+    </w:p>
+    <w:tbl>
+      <w:tblPr>
+        <w:tblW w:w="5000" w:type="pct"/>
+        <w:tblBorders>
+          <w:top w:val="single"/>
+          <w:left w:val="single"/>
+          <w:bottom w:val="single"/>
+          <w:right w:val="single"/>
+          <w:insideH w:val="single"/>
+          <w:insideV w:val="single"/>
+        </w:tblBorders>
+      </w:tblPr>
+      <w:tr>
+        <w:tc>
+          <w:tcPr>
+            <w:tcW w:w="1200" w:type="dxa"/>
+            <w:shd w:color="auto" w:val="clear" w:fill="2B6CB0"/>
+          </w:tcPr>
+          <w:p>
+            <w:pPr>
+              <w:jc w:val="left"/>
+            </w:pPr>
+            <w:r>
+              <w:rPr>
+                <w:b w:val="on"/>
+                <w:sz w:val="20"/>
+                <w:color w:val="FFFFFF"/>
+              </w:rPr>
+              <w:t>Step #</w:t>
+            </w:r>
+          </w:p>
+        </w:tc>
+        <w:tc>
+          <w:tcPr>
+            <w:tcW w:w="4500" w:type="dxa"/>
+            <w:shd w:color="auto" w:val="clear" w:fill="2B6CB0"/>
+          </w:tcPr>
+          <w:p>
+            <w:pPr>
+              <w:jc w:val="left"/>
+            </w:pPr>
+            <w:r>
+              <w:rPr>
+                <w:b w:val="on"/>
+                <w:sz w:val="20"/>
+                <w:color w:val="FFFFFF"/>
+              </w:rPr>
+              <w:t>Actor Action</w:t>
+            </w:r>
+          </w:p>
+        </w:tc>
+        <w:tc>
+          <w:tcPr>
+            <w:tcW w:w="4500" w:type="dxa"/>
+            <w:shd w:color="auto" w:val="clear" w:fill="2B6CB0"/>
+          </w:tcPr>
+          <w:p>
+            <w:pPr>
+              <w:jc w:val="left"/>
+            </w:pPr>
+            <w:r>
+              <w:rPr>
+                <w:b w:val="on"/>
+                <w:sz w:val="20"/>
+                <w:color w:val="FFFFFF"/>
+              </w:rPr>
+              <w:t>Expected Result (System)</w:t>
+            </w:r>
+          </w:p>
+        </w:tc>
+      </w:tr>
+      <w:tr>
+        <w:tc>
+          <w:p>
+            <w:r>
+              <w:rPr>
+                <w:sz w:val="18"/>
+              </w:rPr>
+              <w:t>1</w:t>
+            </w:r>
+          </w:p>
+        </w:tc>
+        <w:tc>
+          <w:p>
+            <w:r>
+              <w:rPr>
+                <w:sz w:val="18"/>
+              </w:rPr>
+              <w:t>administrador: loga no extrator</w:t>
+            </w:r>
+          </w:p>
+        </w:tc>
+        <w:tc>
+          <w:p>
+            <w:r>
+              <w:rPr>
+                <w:sz w:val="18"/>
+              </w:rPr>
+              <w:t>SYSTEM exibe exibe mensagem perguntando se o usuário deseja entrar em modo offline</w:t>
+            </w:r>
+          </w:p>
+        </w:tc>
+      </w:tr>
+      <w:tr>
+        <w:tc>
+          <w:p>
+            <w:r>
+              <w:rPr>
+                <w:sz w:val="18"/>
+              </w:rPr>
+              <w:t>2</w:t>
+            </w:r>
+          </w:p>
+        </w:tc>
+        <w:tc>
+          <w:p>
+            <w:r>
+              <w:rPr>
+                <w:sz w:val="18"/>
+              </w:rPr>
+              <w:t>administrador: pressiona botão Yes</w:t>
+            </w:r>
+          </w:p>
+        </w:tc>
+        <w:tc>
+          <w:p>
+            <w:r>
+              <w:rPr>
+                <w:sz w:val="18"/>
+              </w:rPr>
+              <w:t>SYSTEM exibe tela inicial 'SAFF extraction'</w:t>
+            </w:r>
+          </w:p>
+        </w:tc>
+      </w:tr>
+      <w:tr>
+        <w:tc>
+          <w:p>
+            <w:r>
+              <w:rPr>
+                <w:sz w:val="18"/>
+              </w:rPr>
+              <w:t>3</w:t>
+            </w:r>
+          </w:p>
+        </w:tc>
+        <w:tc>
+          <w:p>
+            <w:r>
+              <w:rPr>
+                <w:sz w:val="18"/>
+              </w:rPr>
+              <w:t>administrador: insere um 'Product number', 'Serial number', tipo de teste 'QA' e pressiona 'Extract'</w:t>
+            </w:r>
+          </w:p>
+        </w:tc>
+        <w:tc>
+          <w:p>
+            <w:r>
+              <w:rPr>
+                <w:sz w:val="18"/>
+              </w:rPr>
+              <w:t>SYSTEM adiciona nova extração a pasta local'</w:t>
+            </w:r>
+          </w:p>
+        </w:tc>
+      </w:tr>
+      <w:tr>
+        <w:tc>
+          <w:p>
+            <w:r>
+              <w:rPr>
+                <w:sz w:val="18"/>
+              </w:rPr>
+              <w:t>4</w:t>
+            </w:r>
+          </w:p>
+        </w:tc>
+        <w:tc>
+          <w:p>
+            <w:r>
+              <w:rPr>
+                <w:sz w:val="18"/>
+              </w:rPr>
+              <w:t>administrador: loga no servidor</w:t>
+            </w:r>
+          </w:p>
+        </w:tc>
+        <w:tc>
+          <w:p>
+            <w:r>
+              <w:rPr>
+                <w:sz w:val="18"/>
+              </w:rPr>
+              <w:t>SYSTEM envia extrações da pasta local para o servidor e as deleta da máquina local</w:t>
+            </w:r>
+          </w:p>
+        </w:tc>
+      </w:tr>
+      <w:tr>
+        <w:tc>
+          <w:p>
+            <w:r>
+              <w:rPr>
+                <w:sz w:val="18"/>
+              </w:rPr>
+              <w:t>5</w:t>
+            </w:r>
+          </w:p>
+        </w:tc>
+        <w:tc>
+          <w:p>
+            <w:r>
+              <w:rPr>
+                <w:sz w:val="18"/>
+              </w:rPr>
+              <w:t>administrador: vai até a página de extrações</w:t>
+            </w:r>
+          </w:p>
+        </w:tc>
+        <w:tc>
+          <w:p>
+            <w:r>
+              <w:rPr>
+                <w:sz w:val="18"/>
+              </w:rPr>
+              <w:t>SYSTEM exibe lista com a extração realizada no modo offline no topo</w:t>
+            </w:r>
+          </w:p>
+        </w:tc>
+      </w:tr>
+    </w:tbl>
+    <w:p>
+      <w:r>
+        <w:br/>
+      </w:r>
+    </w:p>
+    <w:p>
+      <w:pPr>
+        <w:spacing w:before="180" w:after="60"/>
+      </w:pPr>
+      <w:r>
+        <w:rPr>
+          <w:b w:val="on"/>
+          <w:sz w:val="24"/>
+          <w:color w:val="2B6CB0"/>
+        </w:rPr>
+        <w:t>[TC6] Alternative Flow 5: Product number ou serial number inválidos</w:t>
+      </w:r>
+    </w:p>
+    <w:p>
+      <w:pPr>
+        <w:spacing w:after="40"/>
+      </w:pPr>
+      <w:r>
+        <w:rPr>
+          <w:b w:val="on"/>
+          <w:sz w:val="20"/>
+        </w:rPr>
+        <w:t xml:space="preserve">Preconditions: </w:t>
+      </w:r>
+      <w:r>
+        <w:rPr>
+          <w:sz w:val="20"/>
+        </w:rPr>
+        <w:t>Usuário não está logado no servidor</w:t>
+      </w:r>
+    </w:p>
+    <w:p>
+      <w:pPr>
+        <w:spacing w:after="40"/>
+      </w:pPr>
+      <w:r>
+        <w:rPr>
+          <w:b w:val="on"/>
+          <w:sz w:val="20"/>
+        </w:rPr>
+        <w:t xml:space="preserve">Postconditions: </w:t>
+      </w:r>
+      <w:r>
+        <w:rPr>
+          <w:sz w:val="20"/>
+        </w:rPr>
+        <w:t/>
+      </w:r>
+    </w:p>
+    <w:tbl>
+      <w:tblPr>
+        <w:tblW w:w="5000" w:type="pct"/>
+        <w:tblBorders>
+          <w:top w:val="single"/>
+          <w:left w:val="single"/>
+          <w:bottom w:val="single"/>
+          <w:right w:val="single"/>
+          <w:insideH w:val="single"/>
+          <w:insideV w:val="single"/>
+        </w:tblBorders>
+      </w:tblPr>
+      <w:tr>
+        <w:tc>
+          <w:tcPr>
+            <w:tcW w:w="1200" w:type="dxa"/>
+            <w:shd w:color="auto" w:val="clear" w:fill="2B6CB0"/>
+          </w:tcPr>
+          <w:p>
+            <w:pPr>
+              <w:jc w:val="left"/>
+            </w:pPr>
+            <w:r>
+              <w:rPr>
+                <w:b w:val="on"/>
+                <w:sz w:val="20"/>
+                <w:color w:val="FFFFFF"/>
+              </w:rPr>
+              <w:t>Step #</w:t>
+            </w:r>
+          </w:p>
+        </w:tc>
+        <w:tc>
+          <w:tcPr>
+            <w:tcW w:w="4500" w:type="dxa"/>
+            <w:shd w:color="auto" w:val="clear" w:fill="2B6CB0"/>
+          </w:tcPr>
+          <w:p>
+            <w:pPr>
+              <w:jc w:val="left"/>
+            </w:pPr>
+            <w:r>
+              <w:rPr>
+                <w:b w:val="on"/>
+                <w:sz w:val="20"/>
+                <w:color w:val="FFFFFF"/>
+              </w:rPr>
+              <w:t>Actor Action</w:t>
+            </w:r>
+          </w:p>
+        </w:tc>
+        <w:tc>
+          <w:tcPr>
+            <w:tcW w:w="4500" w:type="dxa"/>
+            <w:shd w:color="auto" w:val="clear" w:fill="2B6CB0"/>
+          </w:tcPr>
+          <w:p>
+            <w:pPr>
+              <w:jc w:val="left"/>
+            </w:pPr>
+            <w:r>
+              <w:rPr>
+                <w:b w:val="on"/>
+                <w:sz w:val="20"/>
+                <w:color w:val="FFFFFF"/>
+              </w:rPr>
+              <w:t>Expected Result (System)</w:t>
+            </w:r>
+          </w:p>
+        </w:tc>
+      </w:tr>
+      <w:tr>
+        <w:tc>
+          <w:p>
+            <w:r>
+              <w:rPr>
+                <w:sz w:val="18"/>
+              </w:rPr>
+              <w:t>1</w:t>
+            </w:r>
+          </w:p>
+        </w:tc>
+        <w:tc>
+          <w:p>
+            <w:r>
+              <w:rPr>
+                <w:sz w:val="18"/>
+              </w:rPr>
+              <w:t>administrador: loga no extrator</w:t>
+            </w:r>
+          </w:p>
+        </w:tc>
+        <w:tc>
+          <w:p>
+            <w:r>
+              <w:rPr>
+                <w:sz w:val="18"/>
+              </w:rPr>
+              <w:t>SYSTEM exibe exibe mensagem perguntando se o usuário deseja entrar em modo offline</w:t>
+            </w:r>
+          </w:p>
+        </w:tc>
+      </w:tr>
+      <w:tr>
+        <w:tc>
+          <w:p>
+            <w:r>
+              <w:rPr>
+                <w:sz w:val="18"/>
+              </w:rPr>
+              <w:t>2</w:t>
+            </w:r>
+          </w:p>
+        </w:tc>
+        <w:tc>
+          <w:p>
+            <w:r>
+              <w:rPr>
+                <w:sz w:val="18"/>
+              </w:rPr>
+              <w:t>administrador: pressiona botão Yes</w:t>
+            </w:r>
+          </w:p>
+        </w:tc>
+        <w:tc>
+          <w:p>
+            <w:r>
+              <w:rPr>
+                <w:sz w:val="18"/>
+              </w:rPr>
+              <w:t>SYSTEM exibe tela inicial 'SAFF extraction'</w:t>
+            </w:r>
+          </w:p>
+        </w:tc>
+      </w:tr>
+      <w:tr>
+        <w:tc>
+          <w:p>
+            <w:r>
+              <w:rPr>
+                <w:sz w:val="18"/>
+              </w:rPr>
+              <w:t>3</w:t>
+            </w:r>
+          </w:p>
+        </w:tc>
+        <w:tc>
+          <w:p>
+            <w:r>
+              <w:rPr>
+                <w:sz w:val="18"/>
+              </w:rPr>
+              <w:t>administrador: insere um 'Product number' ou 'Serial number' inválidos e pressiona 'Extract'</w:t>
+            </w:r>
+          </w:p>
+        </w:tc>
+        <w:tc>
+          <w:p>
+            <w:r>
+              <w:rPr>
+                <w:sz w:val="18"/>
+              </w:rPr>
+              <w:t>SYSTEM exibe mensagem solicitando informando que o product number ou serial number são inválidos</w:t>
+            </w:r>
+          </w:p>
+        </w:tc>
+      </w:tr>
+      <w:tr>
+        <w:tc>
+          <w:p>
+            <w:r>
+              <w:rPr>
+                <w:sz w:val="18"/>
+              </w:rPr>
+              <w:t>4</w:t>
+            </w:r>
+          </w:p>
+        </w:tc>
+        <w:tc>
+          <w:p>
+            <w:r>
+              <w:rPr>
+                <w:sz w:val="18"/>
+              </w:rPr>
+              <w:t>administrador: insere um 'Product number', 'Serial number', tipo de teste 'Pre_test' e pressiona 'Extract'</w:t>
+            </w:r>
+          </w:p>
+        </w:tc>
+        <w:tc>
+          <w:p>
+            <w:r>
+              <w:rPr>
+                <w:sz w:val="18"/>
+              </w:rPr>
+              <w:t>SYSTEM adiciona nova extração a pasta local'</w:t>
+            </w:r>
+          </w:p>
+        </w:tc>
+      </w:tr>
+      <w:tr>
+        <w:tc>
+          <w:p>
+            <w:r>
+              <w:rPr>
+                <w:sz w:val="18"/>
+              </w:rPr>
+              <w:t>5</w:t>
+            </w:r>
+          </w:p>
+        </w:tc>
+        <w:tc>
+          <w:p>
+            <w:r>
+              <w:rPr>
+                <w:sz w:val="18"/>
+              </w:rPr>
+              <w:t>administrador: loga no servidor</w:t>
+            </w:r>
+          </w:p>
+        </w:tc>
+        <w:tc>
+          <w:p>
+            <w:r>
+              <w:rPr>
+                <w:sz w:val="18"/>
+              </w:rPr>
+              <w:t>SYSTEM envia extrações da pasta local para o servidor e as deleta da máquina local</w:t>
+            </w:r>
+          </w:p>
+        </w:tc>
+      </w:tr>
+      <w:tr>
+        <w:tc>
+          <w:p>
+            <w:r>
+              <w:rPr>
+                <w:sz w:val="18"/>
+              </w:rPr>
+              <w:t>6</w:t>
+            </w:r>
+          </w:p>
+        </w:tc>
+        <w:tc>
+          <w:p>
+            <w:r>
+              <w:rPr>
+                <w:sz w:val="18"/>
+              </w:rPr>
+              <w:t>administrador: vai até a página de extrações</w:t>
+            </w:r>
+          </w:p>
+        </w:tc>
+        <w:tc>
+          <w:p>
+            <w:r>
+              <w:rPr>
+                <w:sz w:val="18"/>
+              </w:rPr>
+              <w:t>SYSTEM exibe lista com a extração realizada no modo offline no topo</w:t>
+            </w:r>
+          </w:p>
+        </w:tc>
+      </w:tr>
+    </w:tbl>
+    <w:p>
+      <w:r>
+        <w:br/>
+      </w:r>
+    </w:p>
+    <w:p>
+      <w:pPr>
+        <w:spacing w:before="180" w:after="60"/>
+      </w:pPr>
+      <w:r>
+        <w:rPr>
+          <w:b w:val="on"/>
+          <w:sz w:val="24"/>
+          <w:color w:val="2B6CB0"/>
+        </w:rPr>
+        <w:t>[TC7] Exception Flow 2: Cai conexão com servidor</w:t>
+      </w:r>
+    </w:p>
+    <w:p>
+      <w:pPr>
+        <w:spacing w:after="40"/>
+      </w:pPr>
+      <w:r>
+        <w:rPr>
+          <w:b w:val="on"/>
+          <w:sz w:val="20"/>
+        </w:rPr>
+        <w:t xml:space="preserve">Preconditions: </w:t>
+      </w:r>
+      <w:r>
+        <w:rPr>
+          <w:sz w:val="20"/>
+        </w:rPr>
+        <w:t>Usuário não está logado no servidor</w:t>
+      </w:r>
+    </w:p>
+    <w:p>
+      <w:pPr>
+        <w:spacing w:after="40"/>
+      </w:pPr>
+      <w:r>
+        <w:rPr>
+          <w:b w:val="on"/>
+          <w:sz w:val="20"/>
+        </w:rPr>
+        <w:t xml:space="preserve">Postconditions: </w:t>
+      </w:r>
+      <w:r>
+        <w:rPr>
+          <w:sz w:val="20"/>
+        </w:rPr>
+        <w:t>Flow interrupted due to exception / error</w:t>
+      </w:r>
+    </w:p>
+    <w:tbl>
+      <w:tblPr>
+        <w:tblW w:w="5000" w:type="pct"/>
+        <w:tblBorders>
+          <w:top w:val="single"/>
+          <w:left w:val="single"/>
+          <w:bottom w:val="single"/>
+          <w:right w:val="single"/>
+          <w:insideH w:val="single"/>
+          <w:insideV w:val="single"/>
+        </w:tblBorders>
+      </w:tblPr>
+      <w:tr>
+        <w:tc>
+          <w:tcPr>
+            <w:tcW w:w="1200" w:type="dxa"/>
+            <w:shd w:color="auto" w:val="clear" w:fill="2B6CB0"/>
+          </w:tcPr>
+          <w:p>
+            <w:pPr>
+              <w:jc w:val="left"/>
+            </w:pPr>
+            <w:r>
+              <w:rPr>
+                <w:b w:val="on"/>
+                <w:sz w:val="20"/>
+                <w:color w:val="FFFFFF"/>
+              </w:rPr>
+              <w:t>Step #</w:t>
+            </w:r>
+          </w:p>
+        </w:tc>
+        <w:tc>
+          <w:tcPr>
+            <w:tcW w:w="4500" w:type="dxa"/>
+            <w:shd w:color="auto" w:val="clear" w:fill="2B6CB0"/>
+          </w:tcPr>
+          <w:p>
+            <w:pPr>
+              <w:jc w:val="left"/>
+            </w:pPr>
+            <w:r>
+              <w:rPr>
+                <w:b w:val="on"/>
+                <w:sz w:val="20"/>
+                <w:color w:val="FFFFFF"/>
+              </w:rPr>
+              <w:t>Actor Action</w:t>
+            </w:r>
+          </w:p>
+        </w:tc>
+        <w:tc>
+          <w:tcPr>
+            <w:tcW w:w="4500" w:type="dxa"/>
+            <w:shd w:color="auto" w:val="clear" w:fill="2B6CB0"/>
+          </w:tcPr>
+          <w:p>
+            <w:pPr>
+              <w:jc w:val="left"/>
+            </w:pPr>
+            <w:r>
+              <w:rPr>
+                <w:b w:val="on"/>
+                <w:sz w:val="20"/>
+                <w:color w:val="FFFFFF"/>
+              </w:rPr>
+              <w:t>Expected Result (System)</w:t>
+            </w:r>
+          </w:p>
+        </w:tc>
+      </w:tr>
+      <w:tr>
+        <w:tc>
+          <w:p>
+            <w:r>
+              <w:rPr>
+                <w:sz w:val="18"/>
+              </w:rPr>
+              <w:t>1</w:t>
+            </w:r>
+          </w:p>
+        </w:tc>
+        <w:tc>
+          <w:p>
+            <w:r>
+              <w:rPr>
+                <w:sz w:val="18"/>
+              </w:rPr>
+              <w:t>administrador: loga no extrator</w:t>
+            </w:r>
+          </w:p>
+        </w:tc>
+        <w:tc>
+          <w:p>
+            <w:r>
+              <w:rPr>
+                <w:sz w:val="18"/>
+              </w:rPr>
+              <w:t>SYSTEM exibe exibe mensagem perguntando se o usuário deseja entrar em modo offline</w:t>
+            </w:r>
+          </w:p>
+        </w:tc>
+      </w:tr>
+      <w:tr>
+        <w:tc>
+          <w:p>
+            <w:r>
+              <w:rPr>
+                <w:sz w:val="18"/>
+              </w:rPr>
+              <w:t>2</w:t>
+            </w:r>
+          </w:p>
+        </w:tc>
+        <w:tc>
+          <w:p>
+            <w:r>
+              <w:rPr>
+                <w:sz w:val="18"/>
+              </w:rPr>
+              <w:t>administrador: pressiona botão Yes</w:t>
+            </w:r>
+          </w:p>
+        </w:tc>
+        <w:tc>
+          <w:p>
+            <w:r>
+              <w:rPr>
+                <w:sz w:val="18"/>
+              </w:rPr>
+              <w:t>SYSTEM exibe tela inicial 'SAFF extraction'</w:t>
+            </w:r>
+          </w:p>
+        </w:tc>
+      </w:tr>
+      <w:tr>
+        <w:tc>
+          <w:p>
+            <w:r>
+              <w:rPr>
+                <w:sz w:val="18"/>
+              </w:rPr>
+              <w:t>3</w:t>
+            </w:r>
+          </w:p>
+        </w:tc>
+        <w:tc>
+          <w:p>
+            <w:r>
+              <w:rPr>
+                <w:sz w:val="18"/>
+              </w:rPr>
+              <w:t>administrador: insere um 'Product number', 'Serial number', tipo de teste 'Pre_test' e pressiona 'Extract'</w:t>
+            </w:r>
+          </w:p>
+        </w:tc>
+        <w:tc>
+          <w:p>
+            <w:r>
+              <w:rPr>
+                <w:sz w:val="18"/>
+              </w:rPr>
+              <w:t>SYSTEM adiciona nova extração a pasta local'</w:t>
+            </w:r>
+          </w:p>
+        </w:tc>
+      </w:tr>
+      <w:tr>
+        <w:tc>
+          <w:p>
+            <w:r>
+              <w:rPr>
+                <w:sz w:val="18"/>
+              </w:rPr>
+              <w:t>4</w:t>
+            </w:r>
+          </w:p>
+        </w:tc>
+        <w:tc>
+          <w:p>
+            <w:r>
+              <w:rPr>
+                <w:sz w:val="18"/>
+              </w:rPr>
+              <w:t>administrador: loga no servidor</w:t>
+            </w:r>
+          </w:p>
+        </w:tc>
+        <w:tc>
+          <w:p>
+            <w:r>
+              <w:rPr>
+                <w:sz w:val="18"/>
+              </w:rPr>
+              <w:t>SYSTEM exibe mensagem informando quantas extrações foram transferidas para o servidor com sucesso e deleta da pasta local as extrações enviadas com sucesso</w:t>
             </w:r>
           </w:p>
         </w:tc>

</xml_diff>